<commit_message>
Petição Daniela Braga: audiência pelo art. 334 do CPC (rito comum), em destaque verde
Co-Authored-By: Claude Opus 5.5 <noreply@anthropic.com>
Claude-Session: https://claude.ai/code/session_01HhnpasVshMdx9Pz9yR41Yv
</commit_message>
<xml_diff>
--- a/Petição inicial - Daniela Braga/Petição inicial revisada - Daniela Braga Pereira - REVISADA (acréscimos em verde).docx
+++ b/Petição inicial - Daniela Braga/Petição inicial revisada - Daniela Braga Pereira - REVISADA (acréscimos em verde).docx
@@ -418,7 +418,22 @@
           <w:rFonts w:ascii="Lora Medium" w:cs="Lora Medium" w:eastAsia="Lora Medium" w:hAnsi="Lora Medium"/>
           <w:rtl w:val="0"/>
         </w:rPr>
-        <w:t xml:space="preserve">A parte autora manifesta interesse na realização de audiência de conciliação, nos termos do art. 319, VII, do Código de Processo Civil e do art. 21 da Lei nº 9.099/1995.</w:t>
+        <w:t xml:space="preserve">A parte autora manifesta interesse na realização de audiência de conciliação, nos termos do art. 319, VII, do Código de Processo Civil</w:t>
+      </w:r>
+      <w:r>
+        <w:rPr>
+          <w:rFonts w:ascii="Lora Medium" w:cs="Lora Medium" w:eastAsia="Lora Medium" w:hAnsi="Lora Medium"/>
+          <w:highlight w:val="green"/>
+          <w:rtl w:val="0"/>
+        </w:rPr>
+        <w:t xml:space="preserve"> e do art. 334 do mesmo diploma</w:t>
+      </w:r>
+      <w:r>
+        <w:rPr>
+          <w:rFonts w:ascii="Lora Medium" w:cs="Lora Medium" w:eastAsia="Lora Medium" w:hAnsi="Lora Medium"/>
+          <w:rtl w:val="0"/>
+        </w:rPr>
+        <w:t xml:space="preserve">.</w:t>
       </w:r>
       <w:r>
         <w:rPr>

</xml_diff>